<commit_message>
Added to my reflection
</commit_message>
<xml_diff>
--- a/canvas_answers.docx
+++ b/canvas_answers.docx
@@ -753,15 +753,7 @@
       </w:pPr>
       <w:r>
         <w:rPr/>
-        <w:t xml:space="preserve">At -O0 no transformations are applied. </w:t>
-      </w:r>
-      <w:r>
-        <w:rPr/>
-        <w:t>Looking at</w:t>
-      </w:r>
-      <w:r>
-        <w:rPr/>
-        <w:t xml:space="preserve"> main.s shows scalar vmulsd and vaddsd instructions operating on xmm registers, one double at a time, alongside explicit jmp and jl branch instructions on every loop iteration and variables reloaded from the stack via rbp-relative addresses. Performance sits in a flat band around 0.3-0.4x10^9 FLOPS, declining slightly to around 0.2x10^9 at large N.</w:t>
+        <w:t>At -O0 no transformations are applied. Looking at main.s shows scalar vmulsd and vaddsd instructions operating on xmm registers, one double at a time, alongside explicit jmp and jl branch instructions on every loop iteration and variables reloaded from the stack via rbp-relative addresses. Performance sits in a flat band around 0.3-0.4x10^9 FLOPS, declining slightly to around 0.2x10^9 at large N.</w:t>
       </w:r>
     </w:p>
     <w:p>
@@ -1518,15 +1510,7 @@
       </w:pPr>
       <w:r>
         <w:rPr/>
-        <w:t xml:space="preserve">Blocking addresses this by partitioning the matrices into </w:t>
-      </w:r>
-      <w:r>
-        <w:rPr/>
-        <w:t>blocks</w:t>
-      </w:r>
-      <w:r>
-        <w:rPr/>
-        <w:t xml:space="preserve"> of BLOCK_SIZE x BLOCK_SIZE and completing the full k-accumulation for each block before moving on. While one block is being processed, all three block submatrices stay resident in L1, so accesses within the block hit L1 rather than requiring a cache refill.</w:t>
+        <w:t>Blocking addresses this by partitioning the matrices into blocks of BLOCK_SIZE x BLOCK_SIZE and completing the full k-accumulation for each block before moving on. While one block is being processed, all three block submatrices stay resident in L1, so accesses within the block hit L1 rather than requiring a cache refill.</w:t>
       </w:r>
     </w:p>
     <w:p>
@@ -1548,15 +1532,7 @@
       </w:pPr>
       <w:r>
         <w:rPr/>
-        <w:t xml:space="preserve">For the E-cores with 32 KiB L1d, three </w:t>
-      </w:r>
-      <w:r>
-        <w:rPr/>
-        <w:t>blocks</w:t>
-      </w:r>
-      <w:r>
-        <w:rPr/>
-        <w:t xml:space="preserve"> must fit simultaneously:</w:t>
+        <w:t>For the E-cores with 32 KiB L1d, three blocks must fit simultaneously:</w:t>
       </w:r>
     </w:p>
     <w:p>
@@ -2009,7 +1985,23 @@
       </w:pPr>
       <w:r>
         <w:rPr/>
-        <w:t xml:space="preserve">This exercise shows that achieving large speedups requires reasoning from specific hardware parameters rather than applying generic improvements. My decisions here based on the properties of the i7-1355U: the 32 KiB E-core L1d derivation for block size, the thread count data showing 10 outperforms 12, the 4-wide AVX2 stride. </w:t>
+        <w:t xml:space="preserve">This exercise shows that achieving large speedups requires reasoning from specific hardware parameters rather than applying generic improvements. My decisions here based on the properties of the i7-1355U: the 32 KiB E-core L1d derivation for block size, the thread count data showing 10 outperforms 12, the 4-wide AVX2 stride.  The 25x speedup achieved here also highlights how misleading single-number performance claims can be: the same binary running on this machine under different matrix sizes ranges from 6x to 25x faster than baseline, so </w:t>
+      </w:r>
+      <w:r>
+        <w:rPr/>
+        <w:t>the values</w:t>
+      </w:r>
+      <w:r>
+        <w:rPr/>
+        <w:t xml:space="preserve"> without context is meaningless </w:t>
+      </w:r>
+      <w:r>
+        <w:rPr/>
+        <w:t>in my opinio</w:t>
+      </w:r>
+      <w:r>
+        <w:rPr/>
+        <w:t>n.</w:t>
       </w:r>
     </w:p>
     <w:p>

</xml_diff>